<commit_message>
feature: Product based built-in Windows/Linux host health inspection (initialized by team, read-only and non deletable, form → job → report → notification), and complete report template styles and list built-in filtering/viewing, atomic detail viewing.
</commit_message>
<xml_diff>
--- a/web/public/workflow-orchestration/templates/health-inspection-example.docx
+++ b/web/public/workflow-orchestration/templates/health-inspection-example.docx
@@ -4,63 +4,78 @@
   <w:body>
     <w:p>
       <w:pPr>
-        <w:jc w:val="center"/>
+        <w:spacing w:after="40" w:before="0"/>
       </w:pPr>
       <w:r>
         <w:rPr>
           <w:rFonts w:ascii="Microsoft YaHei" w:hAnsi="Microsoft YaHei" w:eastAsia="Microsoft YaHei"/>
           <w:b/>
           <w:color w:val="1F4E79"/>
-          <w:sz w:val="52"/>
+          <w:sz w:val="36"/>
         </w:rPr>
         <w:t>共 {{ summary.total }} 台主机</w:t>
       </w:r>
     </w:p>
     <w:p>
       <w:pPr>
-        <w:jc w:val="center"/>
+        <w:spacing w:after="40" w:before="0"/>
       </w:pPr>
       <w:r>
         <w:rPr>
           <w:rFonts w:ascii="Microsoft YaHei" w:hAnsi="Microsoft YaHei" w:eastAsia="Microsoft YaHei"/>
           <w:b/>
           <w:color w:val="1F4E79"/>
-          <w:sz w:val="40"/>
+          <w:sz w:val="28"/>
         </w:rPr>
         <w:t>主机健康巡检报告</w:t>
       </w:r>
     </w:p>
     <w:p>
       <w:pPr>
-        <w:jc w:val="center"/>
+        <w:spacing w:after="200" w:before="0"/>
       </w:pPr>
       <w:r>
         <w:rPr>
           <w:rFonts w:ascii="Microsoft YaHei" w:hAnsi="Microsoft YaHei" w:eastAsia="Microsoft YaHei"/>
           <w:b w:val="0"/>
           <w:color w:val="64748B"/>
-          <w:sz w:val="24"/>
+          <w:sz w:val="20"/>
         </w:rPr>
-        <w:t>—— 资源与运行状态审计 ——</w:t>
+        <w:t>—— 资源、系统健康与运行状态审计 ——</w:t>
       </w:r>
     </w:p>
     <w:p>
+      <w:pPr>
+        <w:spacing w:after="160" w:before="0"/>
+      </w:pPr>
       <w:r>
+        <w:rPr>
+          <w:rFonts w:ascii="Microsoft YaHei" w:hAnsi="Microsoft YaHei" w:eastAsia="Microsoft YaHei"/>
+          <w:b w:val="0"/>
+          <w:color w:val="94A3B8"/>
+          <w:sz w:val="18"/>
+        </w:rPr>
         <w:t>{%p for r in results %}</w:t>
       </w:r>
     </w:p>
     <w:p>
+      <w:pPr>
+        <w:spacing w:after="120" w:before="0"/>
+      </w:pPr>
       <w:r>
         <w:rPr>
           <w:rFonts w:ascii="Microsoft YaHei" w:hAnsi="Microsoft YaHei" w:eastAsia="Microsoft YaHei"/>
           <w:b/>
           <w:color w:val="1F4E79"/>
-          <w:sz w:val="32"/>
+          <w:sz w:val="24"/>
         </w:rPr>
         <w:t>主机信息</w:t>
       </w:r>
     </w:p>
     <w:p>
+      <w:pPr>
+        <w:spacing w:after="40"/>
+      </w:pPr>
       <w:r>
         <w:rPr>
           <w:rFonts w:ascii="Microsoft YaHei" w:hAnsi="Microsoft YaHei" w:eastAsia="Microsoft YaHei"/>
@@ -81,6 +96,9 @@
       </w:r>
     </w:p>
     <w:p>
+      <w:pPr>
+        <w:spacing w:after="40"/>
+      </w:pPr>
       <w:r>
         <w:rPr>
           <w:rFonts w:ascii="Microsoft YaHei" w:hAnsi="Microsoft YaHei" w:eastAsia="Microsoft YaHei"/>
@@ -101,6 +119,9 @@
       </w:r>
     </w:p>
     <w:p>
+      <w:pPr>
+        <w:spacing w:after="40"/>
+      </w:pPr>
       <w:r>
         <w:rPr>
           <w:rFonts w:ascii="Microsoft YaHei" w:hAnsi="Microsoft YaHei" w:eastAsia="Microsoft YaHei"/>
@@ -121,6 +142,193 @@
       </w:r>
     </w:p>
     <w:p>
+      <w:pPr>
+        <w:spacing w:after="40"/>
+      </w:pPr>
+      <w:r>
+        <w:rPr>
+          <w:rFonts w:ascii="Microsoft YaHei" w:hAnsi="Microsoft YaHei" w:eastAsia="Microsoft YaHei"/>
+          <w:b/>
+          <w:color w:val="334155"/>
+          <w:sz w:val="22"/>
+        </w:rPr>
+        <w:t>主机名：</w:t>
+      </w:r>
+      <w:r>
+        <w:rPr>
+          <w:rFonts w:ascii="Microsoft YaHei" w:hAnsi="Microsoft YaHei" w:eastAsia="Microsoft YaHei"/>
+          <w:b w:val="0"/>
+          <w:color w:val="1E293B"/>
+          <w:sz w:val="22"/>
+        </w:rPr>
+        <w:t>{{ r.data.host.hostname }}</w:t>
+      </w:r>
+    </w:p>
+    <w:p>
+      <w:pPr>
+        <w:spacing w:after="40"/>
+      </w:pPr>
+      <w:r>
+        <w:rPr>
+          <w:rFonts w:ascii="Microsoft YaHei" w:hAnsi="Microsoft YaHei" w:eastAsia="Microsoft YaHei"/>
+          <w:b/>
+          <w:color w:val="334155"/>
+          <w:sz w:val="22"/>
+        </w:rPr>
+        <w:t>系统版本：</w:t>
+      </w:r>
+      <w:r>
+        <w:rPr>
+          <w:rFonts w:ascii="Microsoft YaHei" w:hAnsi="Microsoft YaHei" w:eastAsia="Microsoft YaHei"/>
+          <w:b w:val="0"/>
+          <w:color w:val="1E293B"/>
+          <w:sz w:val="22"/>
+        </w:rPr>
+        <w:t>{{ r.data.host.os_version }}</w:t>
+      </w:r>
+    </w:p>
+    <w:p>
+      <w:pPr>
+        <w:spacing w:after="40"/>
+      </w:pPr>
+      <w:r>
+        <w:rPr>
+          <w:rFonts w:ascii="Microsoft YaHei" w:hAnsi="Microsoft YaHei" w:eastAsia="Microsoft YaHei"/>
+          <w:b/>
+          <w:color w:val="334155"/>
+          <w:sz w:val="22"/>
+        </w:rPr>
+        <w:t>架构：</w:t>
+      </w:r>
+      <w:r>
+        <w:rPr>
+          <w:rFonts w:ascii="Microsoft YaHei" w:hAnsi="Microsoft YaHei" w:eastAsia="Microsoft YaHei"/>
+          <w:b w:val="0"/>
+          <w:color w:val="1E293B"/>
+          <w:sz w:val="22"/>
+        </w:rPr>
+        <w:t>{{ r.data.host.architecture }}</w:t>
+      </w:r>
+    </w:p>
+    <w:p>
+      <w:pPr>
+        <w:spacing w:after="40"/>
+      </w:pPr>
+      <w:r>
+        <w:rPr>
+          <w:rFonts w:ascii="Microsoft YaHei" w:hAnsi="Microsoft YaHei" w:eastAsia="Microsoft YaHei"/>
+          <w:b/>
+          <w:color w:val="334155"/>
+          <w:sz w:val="22"/>
+        </w:rPr>
+        <w:t>开机时长（小时）：</w:t>
+      </w:r>
+      <w:r>
+        <w:rPr>
+          <w:rFonts w:ascii="Microsoft YaHei" w:hAnsi="Microsoft YaHei" w:eastAsia="Microsoft YaHei"/>
+          <w:b w:val="0"/>
+          <w:color w:val="1E293B"/>
+          <w:sz w:val="22"/>
+        </w:rPr>
+        <w:t>{{ r.data.host.uptime_hours }}</w:t>
+      </w:r>
+    </w:p>
+    <w:p>
+      <w:pPr>
+        <w:spacing w:after="40"/>
+      </w:pPr>
+      <w:r>
+        <w:rPr>
+          <w:rFonts w:ascii="Microsoft YaHei" w:hAnsi="Microsoft YaHei" w:eastAsia="Microsoft YaHei"/>
+          <w:b/>
+          <w:color w:val="334155"/>
+          <w:sz w:val="22"/>
+        </w:rPr>
+        <w:t>逻辑 CPU：</w:t>
+      </w:r>
+      <w:r>
+        <w:rPr>
+          <w:rFonts w:ascii="Microsoft YaHei" w:hAnsi="Microsoft YaHei" w:eastAsia="Microsoft YaHei"/>
+          <w:b w:val="0"/>
+          <w:color w:val="1E293B"/>
+          <w:sz w:val="22"/>
+        </w:rPr>
+        <w:t>{{ r.data.host.cpu_cores }}</w:t>
+      </w:r>
+    </w:p>
+    <w:p>
+      <w:pPr>
+        <w:spacing w:after="40"/>
+      </w:pPr>
+      <w:r>
+        <w:rPr>
+          <w:rFonts w:ascii="Microsoft YaHei" w:hAnsi="Microsoft YaHei" w:eastAsia="Microsoft YaHei"/>
+          <w:b/>
+          <w:color w:val="334155"/>
+          <w:sz w:val="22"/>
+        </w:rPr>
+        <w:t>物理内存（GB）：</w:t>
+      </w:r>
+      <w:r>
+        <w:rPr>
+          <w:rFonts w:ascii="Microsoft YaHei" w:hAnsi="Microsoft YaHei" w:eastAsia="Microsoft YaHei"/>
+          <w:b w:val="0"/>
+          <w:color w:val="1E293B"/>
+          <w:sz w:val="22"/>
+        </w:rPr>
+        <w:t>{{ r.data.host.memory_total_gb }}</w:t>
+      </w:r>
+    </w:p>
+    <w:p>
+      <w:pPr>
+        <w:spacing w:after="40"/>
+      </w:pPr>
+      <w:r>
+        <w:rPr>
+          <w:rFonts w:ascii="Microsoft YaHei" w:hAnsi="Microsoft YaHei" w:eastAsia="Microsoft YaHei"/>
+          <w:b/>
+          <w:color w:val="334155"/>
+          <w:sz w:val="22"/>
+        </w:rPr>
+        <w:t>CPU 热点：</w:t>
+      </w:r>
+      <w:r>
+        <w:rPr>
+          <w:rFonts w:ascii="Microsoft YaHei" w:hAnsi="Microsoft YaHei" w:eastAsia="Microsoft YaHei"/>
+          <w:b w:val="0"/>
+          <w:color w:val="1E293B"/>
+          <w:sz w:val="22"/>
+        </w:rPr>
+        <w:t>{{ r.data.host.top_cpu }}</w:t>
+      </w:r>
+    </w:p>
+    <w:p>
+      <w:pPr>
+        <w:spacing w:after="40"/>
+      </w:pPr>
+      <w:r>
+        <w:rPr>
+          <w:rFonts w:ascii="Microsoft YaHei" w:hAnsi="Microsoft YaHei" w:eastAsia="Microsoft YaHei"/>
+          <w:b/>
+          <w:color w:val="334155"/>
+          <w:sz w:val="22"/>
+        </w:rPr>
+        <w:t>内存热点：</w:t>
+      </w:r>
+      <w:r>
+        <w:rPr>
+          <w:rFonts w:ascii="Microsoft YaHei" w:hAnsi="Microsoft YaHei" w:eastAsia="Microsoft YaHei"/>
+          <w:b w:val="0"/>
+          <w:color w:val="1E293B"/>
+          <w:sz w:val="22"/>
+        </w:rPr>
+        <w:t>{{ r.data.host.top_memory }}</w:t>
+      </w:r>
+    </w:p>
+    <w:p>
+      <w:pPr>
+        <w:spacing w:after="40"/>
+      </w:pPr>
       <w:r>
         <w:rPr>
           <w:rFonts w:ascii="Microsoft YaHei" w:hAnsi="Microsoft YaHei" w:eastAsia="Microsoft YaHei"/>
@@ -141,6 +349,9 @@
       </w:r>
     </w:p>
     <w:p>
+      <w:pPr>
+        <w:spacing w:after="40"/>
+      </w:pPr>
       <w:r>
         <w:rPr>
           <w:rFonts w:ascii="Microsoft YaHei" w:hAnsi="Microsoft YaHei" w:eastAsia="Microsoft YaHei"/>
@@ -161,17 +372,23 @@
       </w:r>
     </w:p>
     <w:p>
+      <w:pPr>
+        <w:spacing w:after="80" w:before="0"/>
+      </w:pPr>
       <w:r>
         <w:rPr>
           <w:rFonts w:ascii="Microsoft YaHei" w:hAnsi="Microsoft YaHei" w:eastAsia="Microsoft YaHei"/>
           <w:b/>
           <w:color w:val="1F4E79"/>
-          <w:sz w:val="32"/>
+          <w:sz w:val="24"/>
         </w:rPr>
         <w:t>总体概览</w:t>
       </w:r>
     </w:p>
     <w:p>
+      <w:pPr>
+        <w:spacing w:after="160" w:before="0"/>
+      </w:pPr>
       <w:r>
         <w:rPr>
           <w:rFonts w:ascii="Microsoft YaHei" w:hAnsi="Microsoft YaHei" w:eastAsia="Microsoft YaHei"/>
@@ -179,7 +396,7 @@
           <w:color w:val="334155"/>
           <w:sz w:val="22"/>
         </w:rPr>
-        <w:t>本报告覆盖本次执行的全部授权主机（支持多种操作系统），检查 CPU、内存、磁盘和网络，并按严重、告警、正常三级给出处理优先级。</w:t>
+        <w:t>本报告覆盖本次授权主机，检查计算、内存、磁盘、网络、系统健康、进程热点、基础服务、安全浅检与更新账龄，并按严重、告警、正常三级给出处理优先级。</w:t>
       </w:r>
     </w:p>
     <w:tbl>
@@ -189,17 +406,20 @@
         <w:tblLook w:firstColumn="1" w:firstRow="1" w:lastColumn="0" w:lastRow="0" w:noHBand="0" w:noVBand="1" w:val="04A0"/>
       </w:tblPr>
       <w:tblGrid>
-        <w:gridCol w:w="2880"/>
-        <w:gridCol w:w="2880"/>
-        <w:gridCol w:w="2880"/>
+        <w:gridCol w:w="3324"/>
+        <w:gridCol w:w="3324"/>
+        <w:gridCol w:w="3324"/>
       </w:tblGrid>
       <w:tr>
         <w:tc>
           <w:tcPr>
-            <w:tcW w:type="dxa" w:w="2880"/>
+            <w:tcW w:type="dxa" w:w="3324"/>
             <w:shd w:val="clear" w:color="auto" w:fill="1F4E79"/>
           </w:tcPr>
           <w:p>
+            <w:pPr>
+              <w:jc w:val="center"/>
+            </w:pPr>
             <w:r/>
             <w:r>
               <w:rPr>
@@ -214,10 +434,13 @@
         </w:tc>
         <w:tc>
           <w:tcPr>
-            <w:tcW w:type="dxa" w:w="2880"/>
+            <w:tcW w:type="dxa" w:w="3324"/>
             <w:shd w:val="clear" w:color="auto" w:fill="1F4E79"/>
           </w:tcPr>
           <w:p>
+            <w:pPr>
+              <w:jc w:val="center"/>
+            </w:pPr>
             <w:r/>
             <w:r>
               <w:rPr>
@@ -232,10 +455,13 @@
         </w:tc>
         <w:tc>
           <w:tcPr>
-            <w:tcW w:type="dxa" w:w="2880"/>
+            <w:tcW w:type="dxa" w:w="3324"/>
             <w:shd w:val="clear" w:color="auto" w:fill="1F4E79"/>
           </w:tcPr>
           <w:p>
+            <w:pPr>
+              <w:jc w:val="center"/>
+            </w:pPr>
             <w:r/>
             <w:r>
               <w:rPr>
@@ -252,7 +478,7 @@
       <w:tr>
         <w:tc>
           <w:tcPr>
-            <w:tcW w:type="dxa" w:w="2880"/>
+            <w:tcW w:type="dxa" w:w="3324"/>
           </w:tcPr>
           <w:p>
             <w:r/>
@@ -261,7 +487,7 @@
                 <w:rFonts w:ascii="Microsoft YaHei" w:hAnsi="Microsoft YaHei" w:eastAsia="Microsoft YaHei"/>
                 <w:b w:val="0"/>
                 <w:color w:val="1E293B"/>
-                <w:sz w:val="22"/>
+                <w:sz w:val="20"/>
               </w:rPr>
               <w:t>指标总数</w:t>
             </w:r>
@@ -269,7 +495,7 @@
         </w:tc>
         <w:tc>
           <w:tcPr>
-            <w:tcW w:type="dxa" w:w="2880"/>
+            <w:tcW w:type="dxa" w:w="3324"/>
           </w:tcPr>
           <w:p>
             <w:r/>
@@ -278,7 +504,7 @@
                 <w:rFonts w:ascii="Microsoft YaHei" w:hAnsi="Microsoft YaHei" w:eastAsia="Microsoft YaHei"/>
                 <w:b w:val="0"/>
                 <w:color w:val="1E293B"/>
-                <w:sz w:val="22"/>
+                <w:sz w:val="20"/>
               </w:rPr>
               <w:t>{{ r.data.metric_count }}</w:t>
             </w:r>
@@ -286,7 +512,7 @@
         </w:tc>
         <w:tc>
           <w:tcPr>
-            <w:tcW w:type="dxa" w:w="2880"/>
+            <w:tcW w:type="dxa" w:w="3324"/>
           </w:tcPr>
           <w:p>
             <w:r/>
@@ -295,7 +521,7 @@
                 <w:rFonts w:ascii="Microsoft YaHei" w:hAnsi="Microsoft YaHei" w:eastAsia="Microsoft YaHei"/>
                 <w:b w:val="0"/>
                 <w:color w:val="1E293B"/>
-                <w:sz w:val="22"/>
+                <w:sz w:val="20"/>
               </w:rPr>
               <w:t>本次采集的检查项</w:t>
             </w:r>
@@ -305,7 +531,7 @@
       <w:tr>
         <w:tc>
           <w:tcPr>
-            <w:tcW w:type="dxa" w:w="2880"/>
+            <w:tcW w:type="dxa" w:w="3324"/>
           </w:tcPr>
           <w:p>
             <w:r/>
@@ -314,7 +540,7 @@
                 <w:rFonts w:ascii="Microsoft YaHei" w:hAnsi="Microsoft YaHei" w:eastAsia="Microsoft YaHei"/>
                 <w:b w:val="0"/>
                 <w:color w:val="1E293B"/>
-                <w:sz w:val="22"/>
+                <w:sz w:val="20"/>
               </w:rPr>
               <w:t>严重问题 (Critical)</w:t>
             </w:r>
@@ -322,7 +548,7 @@
         </w:tc>
         <w:tc>
           <w:tcPr>
-            <w:tcW w:type="dxa" w:w="2880"/>
+            <w:tcW w:type="dxa" w:w="3324"/>
           </w:tcPr>
           <w:p>
             <w:r/>
@@ -331,7 +557,7 @@
                 <w:rFonts w:ascii="Microsoft YaHei" w:hAnsi="Microsoft YaHei" w:eastAsia="Microsoft YaHei"/>
                 <w:b w:val="0"/>
                 <w:color w:val="1E293B"/>
-                <w:sz w:val="22"/>
+                <w:sz w:val="20"/>
               </w:rPr>
               <w:t>{{ r.data.critical_count }}</w:t>
             </w:r>
@@ -339,7 +565,7 @@
         </w:tc>
         <w:tc>
           <w:tcPr>
-            <w:tcW w:type="dxa" w:w="2880"/>
+            <w:tcW w:type="dxa" w:w="3324"/>
           </w:tcPr>
           <w:p>
             <w:r/>
@@ -348,7 +574,7 @@
                 <w:rFonts w:ascii="Microsoft YaHei" w:hAnsi="Microsoft YaHei" w:eastAsia="Microsoft YaHei"/>
                 <w:b w:val="0"/>
                 <w:color w:val="1E293B"/>
-                <w:sz w:val="22"/>
+                <w:sz w:val="20"/>
               </w:rPr>
               <w:t>需立即处理</w:t>
             </w:r>
@@ -358,7 +584,7 @@
       <w:tr>
         <w:tc>
           <w:tcPr>
-            <w:tcW w:type="dxa" w:w="2880"/>
+            <w:tcW w:type="dxa" w:w="3324"/>
           </w:tcPr>
           <w:p>
             <w:r/>
@@ -367,7 +593,7 @@
                 <w:rFonts w:ascii="Microsoft YaHei" w:hAnsi="Microsoft YaHei" w:eastAsia="Microsoft YaHei"/>
                 <w:b w:val="0"/>
                 <w:color w:val="1E293B"/>
-                <w:sz w:val="22"/>
+                <w:sz w:val="20"/>
               </w:rPr>
               <w:t>告警问题 (Warning)</w:t>
             </w:r>
@@ -375,7 +601,7 @@
         </w:tc>
         <w:tc>
           <w:tcPr>
-            <w:tcW w:type="dxa" w:w="2880"/>
+            <w:tcW w:type="dxa" w:w="3324"/>
           </w:tcPr>
           <w:p>
             <w:r/>
@@ -384,7 +610,7 @@
                 <w:rFonts w:ascii="Microsoft YaHei" w:hAnsi="Microsoft YaHei" w:eastAsia="Microsoft YaHei"/>
                 <w:b w:val="0"/>
                 <w:color w:val="1E293B"/>
-                <w:sz w:val="22"/>
+                <w:sz w:val="20"/>
               </w:rPr>
               <w:t>{{ r.data.warning_count }}</w:t>
             </w:r>
@@ -392,7 +618,7 @@
         </w:tc>
         <w:tc>
           <w:tcPr>
-            <w:tcW w:type="dxa" w:w="2880"/>
+            <w:tcW w:type="dxa" w:w="3324"/>
           </w:tcPr>
           <w:p>
             <w:r/>
@@ -401,7 +627,7 @@
                 <w:rFonts w:ascii="Microsoft YaHei" w:hAnsi="Microsoft YaHei" w:eastAsia="Microsoft YaHei"/>
                 <w:b w:val="0"/>
                 <w:color w:val="1E293B"/>
-                <w:sz w:val="22"/>
+                <w:sz w:val="20"/>
               </w:rPr>
               <w:t>建议尽快处理</w:t>
             </w:r>
@@ -411,7 +637,7 @@
       <w:tr>
         <w:tc>
           <w:tcPr>
-            <w:tcW w:type="dxa" w:w="2880"/>
+            <w:tcW w:type="dxa" w:w="3324"/>
           </w:tcPr>
           <w:p>
             <w:r/>
@@ -420,7 +646,7 @@
                 <w:rFonts w:ascii="Microsoft YaHei" w:hAnsi="Microsoft YaHei" w:eastAsia="Microsoft YaHei"/>
                 <w:b w:val="0"/>
                 <w:color w:val="1E293B"/>
-                <w:sz w:val="22"/>
+                <w:sz w:val="20"/>
               </w:rPr>
               <w:t>正常项 (Normal)</w:t>
             </w:r>
@@ -428,7 +654,7 @@
         </w:tc>
         <w:tc>
           <w:tcPr>
-            <w:tcW w:type="dxa" w:w="2880"/>
+            <w:tcW w:type="dxa" w:w="3324"/>
           </w:tcPr>
           <w:p>
             <w:r/>
@@ -437,7 +663,7 @@
                 <w:rFonts w:ascii="Microsoft YaHei" w:hAnsi="Microsoft YaHei" w:eastAsia="Microsoft YaHei"/>
                 <w:b w:val="0"/>
                 <w:color w:val="1E293B"/>
-                <w:sz w:val="22"/>
+                <w:sz w:val="20"/>
               </w:rPr>
               <w:t>{{ r.data.normal_count }}</w:t>
             </w:r>
@@ -445,7 +671,7 @@
         </w:tc>
         <w:tc>
           <w:tcPr>
-            <w:tcW w:type="dxa" w:w="2880"/>
+            <w:tcW w:type="dxa" w:w="3324"/>
           </w:tcPr>
           <w:p>
             <w:r/>
@@ -454,7 +680,7 @@
                 <w:rFonts w:ascii="Microsoft YaHei" w:hAnsi="Microsoft YaHei" w:eastAsia="Microsoft YaHei"/>
                 <w:b w:val="0"/>
                 <w:color w:val="1E293B"/>
-                <w:sz w:val="22"/>
+                <w:sz w:val="20"/>
               </w:rPr>
               <w:t>当前处于正常范围</w:t>
             </w:r>
@@ -464,7 +690,7 @@
       <w:tr>
         <w:tc>
           <w:tcPr>
-            <w:tcW w:type="dxa" w:w="2880"/>
+            <w:tcW w:type="dxa" w:w="3324"/>
           </w:tcPr>
           <w:p>
             <w:r/>
@@ -473,7 +699,7 @@
                 <w:rFonts w:ascii="Microsoft YaHei" w:hAnsi="Microsoft YaHei" w:eastAsia="Microsoft YaHei"/>
                 <w:b w:val="0"/>
                 <w:color w:val="1E293B"/>
-                <w:sz w:val="22"/>
+                <w:sz w:val="20"/>
               </w:rPr>
               <w:t>目标总数</w:t>
             </w:r>
@@ -481,7 +707,7 @@
         </w:tc>
         <w:tc>
           <w:tcPr>
-            <w:tcW w:type="dxa" w:w="2880"/>
+            <w:tcW w:type="dxa" w:w="3324"/>
           </w:tcPr>
           <w:p>
             <w:r/>
@@ -490,7 +716,7 @@
                 <w:rFonts w:ascii="Microsoft YaHei" w:hAnsi="Microsoft YaHei" w:eastAsia="Microsoft YaHei"/>
                 <w:b w:val="0"/>
                 <w:color w:val="1E293B"/>
-                <w:sz w:val="22"/>
+                <w:sz w:val="20"/>
               </w:rPr>
               <w:t>{{ summary.total }}</w:t>
             </w:r>
@@ -498,7 +724,7 @@
         </w:tc>
         <w:tc>
           <w:tcPr>
-            <w:tcW w:type="dxa" w:w="2880"/>
+            <w:tcW w:type="dxa" w:w="3324"/>
           </w:tcPr>
           <w:p>
             <w:r/>
@@ -507,7 +733,7 @@
                 <w:rFonts w:ascii="Microsoft YaHei" w:hAnsi="Microsoft YaHei" w:eastAsia="Microsoft YaHei"/>
                 <w:b w:val="0"/>
                 <w:color w:val="1E293B"/>
-                <w:sz w:val="22"/>
+                <w:sz w:val="20"/>
               </w:rPr>
               <w:t>本次执行主机</w:t>
             </w:r>
@@ -517,7 +743,7 @@
       <w:tr>
         <w:tc>
           <w:tcPr>
-            <w:tcW w:type="dxa" w:w="2880"/>
+            <w:tcW w:type="dxa" w:w="3324"/>
           </w:tcPr>
           <w:p>
             <w:r/>
@@ -526,7 +752,7 @@
                 <w:rFonts w:ascii="Microsoft YaHei" w:hAnsi="Microsoft YaHei" w:eastAsia="Microsoft YaHei"/>
                 <w:b w:val="0"/>
                 <w:color w:val="1E293B"/>
-                <w:sz w:val="22"/>
+                <w:sz w:val="20"/>
               </w:rPr>
               <w:t>执行成功</w:t>
             </w:r>
@@ -534,7 +760,7 @@
         </w:tc>
         <w:tc>
           <w:tcPr>
-            <w:tcW w:type="dxa" w:w="2880"/>
+            <w:tcW w:type="dxa" w:w="3324"/>
           </w:tcPr>
           <w:p>
             <w:r/>
@@ -543,7 +769,7 @@
                 <w:rFonts w:ascii="Microsoft YaHei" w:hAnsi="Microsoft YaHei" w:eastAsia="Microsoft YaHei"/>
                 <w:b w:val="0"/>
                 <w:color w:val="1E293B"/>
-                <w:sz w:val="22"/>
+                <w:sz w:val="20"/>
               </w:rPr>
               <w:t>{{ summary.succeeded }}</w:t>
             </w:r>
@@ -551,7 +777,7 @@
         </w:tc>
         <w:tc>
           <w:tcPr>
-            <w:tcW w:type="dxa" w:w="2880"/>
+            <w:tcW w:type="dxa" w:w="3324"/>
           </w:tcPr>
           <w:p>
             <w:r/>
@@ -560,7 +786,7 @@
                 <w:rFonts w:ascii="Microsoft YaHei" w:hAnsi="Microsoft YaHei" w:eastAsia="Microsoft YaHei"/>
                 <w:b w:val="0"/>
                 <w:color w:val="1E293B"/>
-                <w:sz w:val="22"/>
+                <w:sz w:val="20"/>
               </w:rPr>
               <w:t>脚本执行成功的主机</w:t>
             </w:r>
@@ -570,7 +796,7 @@
       <w:tr>
         <w:tc>
           <w:tcPr>
-            <w:tcW w:type="dxa" w:w="2880"/>
+            <w:tcW w:type="dxa" w:w="3324"/>
           </w:tcPr>
           <w:p>
             <w:r/>
@@ -579,7 +805,7 @@
                 <w:rFonts w:ascii="Microsoft YaHei" w:hAnsi="Microsoft YaHei" w:eastAsia="Microsoft YaHei"/>
                 <w:b w:val="0"/>
                 <w:color w:val="1E293B"/>
-                <w:sz w:val="22"/>
+                <w:sz w:val="20"/>
               </w:rPr>
               <w:t>执行失败</w:t>
             </w:r>
@@ -587,7 +813,7 @@
         </w:tc>
         <w:tc>
           <w:tcPr>
-            <w:tcW w:type="dxa" w:w="2880"/>
+            <w:tcW w:type="dxa" w:w="3324"/>
           </w:tcPr>
           <w:p>
             <w:r/>
@@ -596,7 +822,7 @@
                 <w:rFonts w:ascii="Microsoft YaHei" w:hAnsi="Microsoft YaHei" w:eastAsia="Microsoft YaHei"/>
                 <w:b w:val="0"/>
                 <w:color w:val="1E293B"/>
-                <w:sz w:val="22"/>
+                <w:sz w:val="20"/>
               </w:rPr>
               <w:t>{{ summary.failed }}</w:t>
             </w:r>
@@ -604,7 +830,7 @@
         </w:tc>
         <w:tc>
           <w:tcPr>
-            <w:tcW w:type="dxa" w:w="2880"/>
+            <w:tcW w:type="dxa" w:w="3324"/>
           </w:tcPr>
           <w:p>
             <w:r/>
@@ -613,7 +839,7 @@
                 <w:rFonts w:ascii="Microsoft YaHei" w:hAnsi="Microsoft YaHei" w:eastAsia="Microsoft YaHei"/>
                 <w:b w:val="0"/>
                 <w:color w:val="1E293B"/>
-                <w:sz w:val="22"/>
+                <w:sz w:val="20"/>
               </w:rPr>
               <w:t>脚本执行失败的主机</w:t>
             </w:r>
@@ -621,18 +847,25 @@
         </w:tc>
       </w:tr>
     </w:tbl>
+    <w:p/>
     <w:p>
+      <w:pPr>
+        <w:spacing w:after="40" w:before="0"/>
+      </w:pPr>
       <w:r>
         <w:rPr>
           <w:rFonts w:ascii="Microsoft YaHei" w:hAnsi="Microsoft YaHei" w:eastAsia="Microsoft YaHei"/>
           <w:b/>
           <w:color w:val="C0392B"/>
-          <w:sz w:val="32"/>
+          <w:sz w:val="24"/>
         </w:rPr>
         <w:t>严重问题 (Critical)</w:t>
       </w:r>
     </w:p>
     <w:p>
+      <w:pPr>
+        <w:spacing w:after="120" w:before="0"/>
+      </w:pPr>
       <w:r>
         <w:rPr>
           <w:rFonts w:ascii="Microsoft YaHei" w:hAnsi="Microsoft YaHei" w:eastAsia="Microsoft YaHei"/>
@@ -640,7 +873,7 @@
           <w:color w:val="334155"/>
           <w:sz w:val="22"/>
         </w:rPr>
-        <w:t>以下问题存在直接的运行风险，必须立即处理。</w:t>
+        <w:t>以下问题存在直接的运行风险，必须立即处理。若无数据表示本主机无严重项。</w:t>
       </w:r>
     </w:p>
     <w:tbl>
@@ -650,20 +883,23 @@
         <w:tblLook w:firstColumn="1" w:firstRow="1" w:lastColumn="0" w:lastRow="0" w:noHBand="0" w:noVBand="1" w:val="04A0"/>
       </w:tblPr>
       <w:tblGrid>
-        <w:gridCol w:w="1440"/>
-        <w:gridCol w:w="1440"/>
-        <w:gridCol w:w="1440"/>
-        <w:gridCol w:w="1440"/>
-        <w:gridCol w:w="1440"/>
-        <w:gridCol w:w="1440"/>
+        <w:gridCol w:w="1662"/>
+        <w:gridCol w:w="1662"/>
+        <w:gridCol w:w="1662"/>
+        <w:gridCol w:w="1662"/>
+        <w:gridCol w:w="1662"/>
+        <w:gridCol w:w="1662"/>
       </w:tblGrid>
       <w:tr>
         <w:tc>
           <w:tcPr>
-            <w:tcW w:type="dxa" w:w="1440"/>
+            <w:tcW w:type="dxa" w:w="1662"/>
             <w:shd w:val="clear" w:color="auto" w:fill="C0392B"/>
           </w:tcPr>
           <w:p>
+            <w:pPr>
+              <w:jc w:val="center"/>
+            </w:pPr>
             <w:r/>
             <w:r>
               <w:rPr>
@@ -678,10 +914,13 @@
         </w:tc>
         <w:tc>
           <w:tcPr>
-            <w:tcW w:type="dxa" w:w="1440"/>
+            <w:tcW w:type="dxa" w:w="1662"/>
             <w:shd w:val="clear" w:color="auto" w:fill="C0392B"/>
           </w:tcPr>
           <w:p>
+            <w:pPr>
+              <w:jc w:val="center"/>
+            </w:pPr>
             <w:r/>
             <w:r>
               <w:rPr>
@@ -696,10 +935,13 @@
         </w:tc>
         <w:tc>
           <w:tcPr>
-            <w:tcW w:type="dxa" w:w="1440"/>
+            <w:tcW w:type="dxa" w:w="1662"/>
             <w:shd w:val="clear" w:color="auto" w:fill="C0392B"/>
           </w:tcPr>
           <w:p>
+            <w:pPr>
+              <w:jc w:val="center"/>
+            </w:pPr>
             <w:r/>
             <w:r>
               <w:rPr>
@@ -714,10 +956,13 @@
         </w:tc>
         <w:tc>
           <w:tcPr>
-            <w:tcW w:type="dxa" w:w="1440"/>
+            <w:tcW w:type="dxa" w:w="1662"/>
             <w:shd w:val="clear" w:color="auto" w:fill="C0392B"/>
           </w:tcPr>
           <w:p>
+            <w:pPr>
+              <w:jc w:val="center"/>
+            </w:pPr>
             <w:r/>
             <w:r>
               <w:rPr>
@@ -732,10 +977,13 @@
         </w:tc>
         <w:tc>
           <w:tcPr>
-            <w:tcW w:type="dxa" w:w="1440"/>
+            <w:tcW w:type="dxa" w:w="1662"/>
             <w:shd w:val="clear" w:color="auto" w:fill="C0392B"/>
           </w:tcPr>
           <w:p>
+            <w:pPr>
+              <w:jc w:val="center"/>
+            </w:pPr>
             <w:r/>
             <w:r>
               <w:rPr>
@@ -750,10 +998,13 @@
         </w:tc>
         <w:tc>
           <w:tcPr>
-            <w:tcW w:type="dxa" w:w="1440"/>
+            <w:tcW w:type="dxa" w:w="1662"/>
             <w:shd w:val="clear" w:color="auto" w:fill="C0392B"/>
           </w:tcPr>
           <w:p>
+            <w:pPr>
+              <w:jc w:val="center"/>
+            </w:pPr>
             <w:r/>
             <w:r>
               <w:rPr>
@@ -770,41 +1021,48 @@
       <w:tr>
         <w:tc>
           <w:tcPr>
-            <w:tcW w:type="dxa" w:w="1440"/>
+            <w:tcW w:type="dxa" w:w="1662"/>
           </w:tcPr>
           <w:p>
+            <w:r/>
             <w:r>
+              <w:rPr>
+                <w:rFonts w:ascii="Microsoft YaHei" w:hAnsi="Microsoft YaHei" w:eastAsia="Microsoft YaHei"/>
+                <w:b w:val="0"/>
+                <w:color w:val="94A3B8"/>
+                <w:sz w:val="18"/>
+              </w:rPr>
               <w:t>{%tr for m in r.data.critical|default([]) %}</w:t>
             </w:r>
           </w:p>
         </w:tc>
         <w:tc>
           <w:tcPr>
-            <w:tcW w:type="dxa" w:w="1440"/>
+            <w:tcW w:type="dxa" w:w="1662"/>
           </w:tcPr>
           <w:p/>
         </w:tc>
         <w:tc>
           <w:tcPr>
-            <w:tcW w:type="dxa" w:w="1440"/>
+            <w:tcW w:type="dxa" w:w="1662"/>
           </w:tcPr>
           <w:p/>
         </w:tc>
         <w:tc>
           <w:tcPr>
-            <w:tcW w:type="dxa" w:w="1440"/>
+            <w:tcW w:type="dxa" w:w="1662"/>
           </w:tcPr>
           <w:p/>
         </w:tc>
         <w:tc>
           <w:tcPr>
-            <w:tcW w:type="dxa" w:w="1440"/>
+            <w:tcW w:type="dxa" w:w="1662"/>
           </w:tcPr>
           <w:p/>
         </w:tc>
         <w:tc>
           <w:tcPr>
-            <w:tcW w:type="dxa" w:w="1440"/>
+            <w:tcW w:type="dxa" w:w="1662"/>
           </w:tcPr>
           <w:p/>
         </w:tc>
@@ -812,7 +1070,7 @@
       <w:tr>
         <w:tc>
           <w:tcPr>
-            <w:tcW w:type="dxa" w:w="1440"/>
+            <w:tcW w:type="dxa" w:w="1662"/>
           </w:tcPr>
           <w:p>
             <w:r/>
@@ -821,7 +1079,7 @@
                 <w:rFonts w:ascii="Microsoft YaHei" w:hAnsi="Microsoft YaHei" w:eastAsia="Microsoft YaHei"/>
                 <w:b w:val="0"/>
                 <w:color w:val="1E293B"/>
-                <w:sz w:val="22"/>
+                <w:sz w:val="20"/>
               </w:rPr>
               <w:t>{{ m.object_name }}</w:t>
             </w:r>
@@ -829,7 +1087,7 @@
         </w:tc>
         <w:tc>
           <w:tcPr>
-            <w:tcW w:type="dxa" w:w="1440"/>
+            <w:tcW w:type="dxa" w:w="1662"/>
           </w:tcPr>
           <w:p>
             <w:r/>
@@ -838,7 +1096,7 @@
                 <w:rFonts w:ascii="Microsoft YaHei" w:hAnsi="Microsoft YaHei" w:eastAsia="Microsoft YaHei"/>
                 <w:b w:val="0"/>
                 <w:color w:val="1E293B"/>
-                <w:sz w:val="22"/>
+                <w:sz w:val="20"/>
               </w:rPr>
               <w:t>{{ m.category }}</w:t>
             </w:r>
@@ -846,7 +1104,7 @@
         </w:tc>
         <w:tc>
           <w:tcPr>
-            <w:tcW w:type="dxa" w:w="1440"/>
+            <w:tcW w:type="dxa" w:w="1662"/>
           </w:tcPr>
           <w:p>
             <w:r/>
@@ -855,15 +1113,15 @@
                 <w:rFonts w:ascii="Microsoft YaHei" w:hAnsi="Microsoft YaHei" w:eastAsia="Microsoft YaHei"/>
                 <w:b w:val="0"/>
                 <w:color w:val="1E293B"/>
-                <w:sz w:val="22"/>
+                <w:sz w:val="20"/>
               </w:rPr>
-              <w:t>{{ m.metric_name }}</w:t>
+              <w:t>{{ m.display_name|default(m.metric_name) }}</w:t>
             </w:r>
           </w:p>
         </w:tc>
         <w:tc>
           <w:tcPr>
-            <w:tcW w:type="dxa" w:w="1440"/>
+            <w:tcW w:type="dxa" w:w="1662"/>
           </w:tcPr>
           <w:p>
             <w:r/>
@@ -872,7 +1130,7 @@
                 <w:rFonts w:ascii="Microsoft YaHei" w:hAnsi="Microsoft YaHei" w:eastAsia="Microsoft YaHei"/>
                 <w:b w:val="0"/>
                 <w:color w:val="1E293B"/>
-                <w:sz w:val="22"/>
+                <w:sz w:val="20"/>
               </w:rPr>
               <w:t>{{ m.value }} {{ m.unit }}</w:t>
             </w:r>
@@ -880,7 +1138,7 @@
         </w:tc>
         <w:tc>
           <w:tcPr>
-            <w:tcW w:type="dxa" w:w="1440"/>
+            <w:tcW w:type="dxa" w:w="1662"/>
           </w:tcPr>
           <w:p>
             <w:r/>
@@ -889,7 +1147,7 @@
                 <w:rFonts w:ascii="Microsoft YaHei" w:hAnsi="Microsoft YaHei" w:eastAsia="Microsoft YaHei"/>
                 <w:b w:val="0"/>
                 <w:color w:val="1E293B"/>
-                <w:sz w:val="22"/>
+                <w:sz w:val="20"/>
               </w:rPr>
               <w:t>告警 {{ m.warning_threshold }} / 严重 {{ m.critical_threshold }}</w:t>
             </w:r>
@@ -897,7 +1155,7 @@
         </w:tc>
         <w:tc>
           <w:tcPr>
-            <w:tcW w:type="dxa" w:w="1440"/>
+            <w:tcW w:type="dxa" w:w="1662"/>
           </w:tcPr>
           <w:p>
             <w:r/>
@@ -906,7 +1164,7 @@
                 <w:rFonts w:ascii="Microsoft YaHei" w:hAnsi="Microsoft YaHei" w:eastAsia="Microsoft YaHei"/>
                 <w:b w:val="0"/>
                 <w:color w:val="1E293B"/>
-                <w:sz w:val="22"/>
+                <w:sz w:val="20"/>
               </w:rPr>
               <w:t>{{ m.detail }}</w:t>
             </w:r>
@@ -916,58 +1174,72 @@
       <w:tr>
         <w:tc>
           <w:tcPr>
-            <w:tcW w:type="dxa" w:w="1440"/>
+            <w:tcW w:type="dxa" w:w="1662"/>
           </w:tcPr>
           <w:p>
+            <w:r/>
             <w:r>
+              <w:rPr>
+                <w:rFonts w:ascii="Microsoft YaHei" w:hAnsi="Microsoft YaHei" w:eastAsia="Microsoft YaHei"/>
+                <w:b w:val="0"/>
+                <w:color w:val="94A3B8"/>
+                <w:sz w:val="18"/>
+              </w:rPr>
               <w:t>{%tr endfor %}</w:t>
             </w:r>
           </w:p>
         </w:tc>
         <w:tc>
           <w:tcPr>
-            <w:tcW w:type="dxa" w:w="1440"/>
+            <w:tcW w:type="dxa" w:w="1662"/>
           </w:tcPr>
           <w:p/>
         </w:tc>
         <w:tc>
           <w:tcPr>
-            <w:tcW w:type="dxa" w:w="1440"/>
+            <w:tcW w:type="dxa" w:w="1662"/>
           </w:tcPr>
           <w:p/>
         </w:tc>
         <w:tc>
           <w:tcPr>
-            <w:tcW w:type="dxa" w:w="1440"/>
+            <w:tcW w:type="dxa" w:w="1662"/>
           </w:tcPr>
           <w:p/>
         </w:tc>
         <w:tc>
           <w:tcPr>
-            <w:tcW w:type="dxa" w:w="1440"/>
+            <w:tcW w:type="dxa" w:w="1662"/>
           </w:tcPr>
           <w:p/>
         </w:tc>
         <w:tc>
           <w:tcPr>
-            <w:tcW w:type="dxa" w:w="1440"/>
+            <w:tcW w:type="dxa" w:w="1662"/>
           </w:tcPr>
           <w:p/>
         </w:tc>
       </w:tr>
     </w:tbl>
+    <w:p/>
     <w:p>
+      <w:pPr>
+        <w:spacing w:after="40" w:before="0"/>
+      </w:pPr>
       <w:r>
         <w:rPr>
           <w:rFonts w:ascii="Microsoft YaHei" w:hAnsi="Microsoft YaHei" w:eastAsia="Microsoft YaHei"/>
           <w:b/>
           <w:color w:val="B7791F"/>
-          <w:sz w:val="32"/>
+          <w:sz w:val="24"/>
         </w:rPr>
         <w:t>告警问题 (Warning)</w:t>
       </w:r>
     </w:p>
     <w:p>
+      <w:pPr>
+        <w:spacing w:after="120" w:before="0"/>
+      </w:pPr>
       <w:r>
         <w:rPr>
           <w:rFonts w:ascii="Microsoft YaHei" w:hAnsi="Microsoft YaHei" w:eastAsia="Microsoft YaHei"/>
@@ -975,7 +1247,7 @@
           <w:color w:val="334155"/>
           <w:sz w:val="22"/>
         </w:rPr>
-        <w:t>以下问题影响主机稳定性，建议尽快处理。</w:t>
+        <w:t>以下问题影响主机稳定性，建议尽快处理。若无数据表示本主机无告警项。</w:t>
       </w:r>
     </w:p>
     <w:tbl>
@@ -985,20 +1257,23 @@
         <w:tblLook w:firstColumn="1" w:firstRow="1" w:lastColumn="0" w:lastRow="0" w:noHBand="0" w:noVBand="1" w:val="04A0"/>
       </w:tblPr>
       <w:tblGrid>
-        <w:gridCol w:w="1440"/>
-        <w:gridCol w:w="1440"/>
-        <w:gridCol w:w="1440"/>
-        <w:gridCol w:w="1440"/>
-        <w:gridCol w:w="1440"/>
-        <w:gridCol w:w="1440"/>
+        <w:gridCol w:w="1662"/>
+        <w:gridCol w:w="1662"/>
+        <w:gridCol w:w="1662"/>
+        <w:gridCol w:w="1662"/>
+        <w:gridCol w:w="1662"/>
+        <w:gridCol w:w="1662"/>
       </w:tblGrid>
       <w:tr>
         <w:tc>
           <w:tcPr>
-            <w:tcW w:type="dxa" w:w="1440"/>
+            <w:tcW w:type="dxa" w:w="1662"/>
             <w:shd w:val="clear" w:color="auto" w:fill="B7791F"/>
           </w:tcPr>
           <w:p>
+            <w:pPr>
+              <w:jc w:val="center"/>
+            </w:pPr>
             <w:r/>
             <w:r>
               <w:rPr>
@@ -1013,10 +1288,13 @@
         </w:tc>
         <w:tc>
           <w:tcPr>
-            <w:tcW w:type="dxa" w:w="1440"/>
+            <w:tcW w:type="dxa" w:w="1662"/>
             <w:shd w:val="clear" w:color="auto" w:fill="B7791F"/>
           </w:tcPr>
           <w:p>
+            <w:pPr>
+              <w:jc w:val="center"/>
+            </w:pPr>
             <w:r/>
             <w:r>
               <w:rPr>
@@ -1031,10 +1309,13 @@
         </w:tc>
         <w:tc>
           <w:tcPr>
-            <w:tcW w:type="dxa" w:w="1440"/>
+            <w:tcW w:type="dxa" w:w="1662"/>
             <w:shd w:val="clear" w:color="auto" w:fill="B7791F"/>
           </w:tcPr>
           <w:p>
+            <w:pPr>
+              <w:jc w:val="center"/>
+            </w:pPr>
             <w:r/>
             <w:r>
               <w:rPr>
@@ -1049,10 +1330,13 @@
         </w:tc>
         <w:tc>
           <w:tcPr>
-            <w:tcW w:type="dxa" w:w="1440"/>
+            <w:tcW w:type="dxa" w:w="1662"/>
             <w:shd w:val="clear" w:color="auto" w:fill="B7791F"/>
           </w:tcPr>
           <w:p>
+            <w:pPr>
+              <w:jc w:val="center"/>
+            </w:pPr>
             <w:r/>
             <w:r>
               <w:rPr>
@@ -1067,10 +1351,13 @@
         </w:tc>
         <w:tc>
           <w:tcPr>
-            <w:tcW w:type="dxa" w:w="1440"/>
+            <w:tcW w:type="dxa" w:w="1662"/>
             <w:shd w:val="clear" w:color="auto" w:fill="B7791F"/>
           </w:tcPr>
           <w:p>
+            <w:pPr>
+              <w:jc w:val="center"/>
+            </w:pPr>
             <w:r/>
             <w:r>
               <w:rPr>
@@ -1085,10 +1372,13 @@
         </w:tc>
         <w:tc>
           <w:tcPr>
-            <w:tcW w:type="dxa" w:w="1440"/>
+            <w:tcW w:type="dxa" w:w="1662"/>
             <w:shd w:val="clear" w:color="auto" w:fill="B7791F"/>
           </w:tcPr>
           <w:p>
+            <w:pPr>
+              <w:jc w:val="center"/>
+            </w:pPr>
             <w:r/>
             <w:r>
               <w:rPr>
@@ -1105,41 +1395,48 @@
       <w:tr>
         <w:tc>
           <w:tcPr>
-            <w:tcW w:type="dxa" w:w="1440"/>
+            <w:tcW w:type="dxa" w:w="1662"/>
           </w:tcPr>
           <w:p>
+            <w:r/>
             <w:r>
+              <w:rPr>
+                <w:rFonts w:ascii="Microsoft YaHei" w:hAnsi="Microsoft YaHei" w:eastAsia="Microsoft YaHei"/>
+                <w:b w:val="0"/>
+                <w:color w:val="94A3B8"/>
+                <w:sz w:val="18"/>
+              </w:rPr>
               <w:t>{%tr for m in r.data.warning|default([]) %}</w:t>
             </w:r>
           </w:p>
         </w:tc>
         <w:tc>
           <w:tcPr>
-            <w:tcW w:type="dxa" w:w="1440"/>
+            <w:tcW w:type="dxa" w:w="1662"/>
           </w:tcPr>
           <w:p/>
         </w:tc>
         <w:tc>
           <w:tcPr>
-            <w:tcW w:type="dxa" w:w="1440"/>
+            <w:tcW w:type="dxa" w:w="1662"/>
           </w:tcPr>
           <w:p/>
         </w:tc>
         <w:tc>
           <w:tcPr>
-            <w:tcW w:type="dxa" w:w="1440"/>
+            <w:tcW w:type="dxa" w:w="1662"/>
           </w:tcPr>
           <w:p/>
         </w:tc>
         <w:tc>
           <w:tcPr>
-            <w:tcW w:type="dxa" w:w="1440"/>
+            <w:tcW w:type="dxa" w:w="1662"/>
           </w:tcPr>
           <w:p/>
         </w:tc>
         <w:tc>
           <w:tcPr>
-            <w:tcW w:type="dxa" w:w="1440"/>
+            <w:tcW w:type="dxa" w:w="1662"/>
           </w:tcPr>
           <w:p/>
         </w:tc>
@@ -1147,7 +1444,7 @@
       <w:tr>
         <w:tc>
           <w:tcPr>
-            <w:tcW w:type="dxa" w:w="1440"/>
+            <w:tcW w:type="dxa" w:w="1662"/>
           </w:tcPr>
           <w:p>
             <w:r/>
@@ -1156,7 +1453,7 @@
                 <w:rFonts w:ascii="Microsoft YaHei" w:hAnsi="Microsoft YaHei" w:eastAsia="Microsoft YaHei"/>
                 <w:b w:val="0"/>
                 <w:color w:val="1E293B"/>
-                <w:sz w:val="22"/>
+                <w:sz w:val="20"/>
               </w:rPr>
               <w:t>{{ m.object_name }}</w:t>
             </w:r>
@@ -1164,7 +1461,7 @@
         </w:tc>
         <w:tc>
           <w:tcPr>
-            <w:tcW w:type="dxa" w:w="1440"/>
+            <w:tcW w:type="dxa" w:w="1662"/>
           </w:tcPr>
           <w:p>
             <w:r/>
@@ -1173,7 +1470,7 @@
                 <w:rFonts w:ascii="Microsoft YaHei" w:hAnsi="Microsoft YaHei" w:eastAsia="Microsoft YaHei"/>
                 <w:b w:val="0"/>
                 <w:color w:val="1E293B"/>
-                <w:sz w:val="22"/>
+                <w:sz w:val="20"/>
               </w:rPr>
               <w:t>{{ m.category }}</w:t>
             </w:r>
@@ -1181,7 +1478,7 @@
         </w:tc>
         <w:tc>
           <w:tcPr>
-            <w:tcW w:type="dxa" w:w="1440"/>
+            <w:tcW w:type="dxa" w:w="1662"/>
           </w:tcPr>
           <w:p>
             <w:r/>
@@ -1190,15 +1487,15 @@
                 <w:rFonts w:ascii="Microsoft YaHei" w:hAnsi="Microsoft YaHei" w:eastAsia="Microsoft YaHei"/>
                 <w:b w:val="0"/>
                 <w:color w:val="1E293B"/>
-                <w:sz w:val="22"/>
+                <w:sz w:val="20"/>
               </w:rPr>
-              <w:t>{{ m.metric_name }}</w:t>
+              <w:t>{{ m.display_name|default(m.metric_name) }}</w:t>
             </w:r>
           </w:p>
         </w:tc>
         <w:tc>
           <w:tcPr>
-            <w:tcW w:type="dxa" w:w="1440"/>
+            <w:tcW w:type="dxa" w:w="1662"/>
           </w:tcPr>
           <w:p>
             <w:r/>
@@ -1207,7 +1504,7 @@
                 <w:rFonts w:ascii="Microsoft YaHei" w:hAnsi="Microsoft YaHei" w:eastAsia="Microsoft YaHei"/>
                 <w:b w:val="0"/>
                 <w:color w:val="1E293B"/>
-                <w:sz w:val="22"/>
+                <w:sz w:val="20"/>
               </w:rPr>
               <w:t>{{ m.value }} {{ m.unit }}</w:t>
             </w:r>
@@ -1215,7 +1512,7 @@
         </w:tc>
         <w:tc>
           <w:tcPr>
-            <w:tcW w:type="dxa" w:w="1440"/>
+            <w:tcW w:type="dxa" w:w="1662"/>
           </w:tcPr>
           <w:p>
             <w:r/>
@@ -1224,7 +1521,7 @@
                 <w:rFonts w:ascii="Microsoft YaHei" w:hAnsi="Microsoft YaHei" w:eastAsia="Microsoft YaHei"/>
                 <w:b w:val="0"/>
                 <w:color w:val="1E293B"/>
-                <w:sz w:val="22"/>
+                <w:sz w:val="20"/>
               </w:rPr>
               <w:t>告警 {{ m.warning_threshold }} / 严重 {{ m.critical_threshold }}</w:t>
             </w:r>
@@ -1232,7 +1529,7 @@
         </w:tc>
         <w:tc>
           <w:tcPr>
-            <w:tcW w:type="dxa" w:w="1440"/>
+            <w:tcW w:type="dxa" w:w="1662"/>
           </w:tcPr>
           <w:p>
             <w:r/>
@@ -1241,7 +1538,7 @@
                 <w:rFonts w:ascii="Microsoft YaHei" w:hAnsi="Microsoft YaHei" w:eastAsia="Microsoft YaHei"/>
                 <w:b w:val="0"/>
                 <w:color w:val="1E293B"/>
-                <w:sz w:val="22"/>
+                <w:sz w:val="20"/>
               </w:rPr>
               <w:t>{{ m.detail }}</w:t>
             </w:r>
@@ -1251,58 +1548,72 @@
       <w:tr>
         <w:tc>
           <w:tcPr>
-            <w:tcW w:type="dxa" w:w="1440"/>
+            <w:tcW w:type="dxa" w:w="1662"/>
           </w:tcPr>
           <w:p>
+            <w:r/>
             <w:r>
+              <w:rPr>
+                <w:rFonts w:ascii="Microsoft YaHei" w:hAnsi="Microsoft YaHei" w:eastAsia="Microsoft YaHei"/>
+                <w:b w:val="0"/>
+                <w:color w:val="94A3B8"/>
+                <w:sz w:val="18"/>
+              </w:rPr>
               <w:t>{%tr endfor %}</w:t>
             </w:r>
           </w:p>
         </w:tc>
         <w:tc>
           <w:tcPr>
-            <w:tcW w:type="dxa" w:w="1440"/>
+            <w:tcW w:type="dxa" w:w="1662"/>
           </w:tcPr>
           <w:p/>
         </w:tc>
         <w:tc>
           <w:tcPr>
-            <w:tcW w:type="dxa" w:w="1440"/>
+            <w:tcW w:type="dxa" w:w="1662"/>
           </w:tcPr>
           <w:p/>
         </w:tc>
         <w:tc>
           <w:tcPr>
-            <w:tcW w:type="dxa" w:w="1440"/>
+            <w:tcW w:type="dxa" w:w="1662"/>
           </w:tcPr>
           <w:p/>
         </w:tc>
         <w:tc>
           <w:tcPr>
-            <w:tcW w:type="dxa" w:w="1440"/>
+            <w:tcW w:type="dxa" w:w="1662"/>
           </w:tcPr>
           <w:p/>
         </w:tc>
         <w:tc>
           <w:tcPr>
-            <w:tcW w:type="dxa" w:w="1440"/>
+            <w:tcW w:type="dxa" w:w="1662"/>
           </w:tcPr>
           <w:p/>
         </w:tc>
       </w:tr>
     </w:tbl>
+    <w:p/>
     <w:p>
+      <w:pPr>
+        <w:spacing w:after="40" w:before="0"/>
+      </w:pPr>
       <w:r>
         <w:rPr>
           <w:rFonts w:ascii="Microsoft YaHei" w:hAnsi="Microsoft YaHei" w:eastAsia="Microsoft YaHei"/>
           <w:b/>
           <w:color w:val="1F7A4D"/>
-          <w:sz w:val="32"/>
+          <w:sz w:val="24"/>
         </w:rPr>
         <w:t>正常项 (Normal)</w:t>
       </w:r>
     </w:p>
     <w:p>
+      <w:pPr>
+        <w:spacing w:after="120" w:before="0"/>
+      </w:pPr>
       <w:r>
         <w:rPr>
           <w:rFonts w:ascii="Microsoft YaHei" w:hAnsi="Microsoft YaHei" w:eastAsia="Microsoft YaHei"/>
@@ -1310,7 +1621,7 @@
           <w:color w:val="334155"/>
           <w:sz w:val="22"/>
         </w:rPr>
-        <w:t>以下检查项当前处于正常范围。</w:t>
+        <w:t>以下检查项当前处于正常范围，含进程热点等观察项。</w:t>
       </w:r>
     </w:p>
     <w:tbl>
@@ -1320,20 +1631,23 @@
         <w:tblLook w:firstColumn="1" w:firstRow="1" w:lastColumn="0" w:lastRow="0" w:noHBand="0" w:noVBand="1" w:val="04A0"/>
       </w:tblPr>
       <w:tblGrid>
-        <w:gridCol w:w="1440"/>
-        <w:gridCol w:w="1440"/>
-        <w:gridCol w:w="1440"/>
-        <w:gridCol w:w="1440"/>
-        <w:gridCol w:w="1440"/>
-        <w:gridCol w:w="1440"/>
+        <w:gridCol w:w="1662"/>
+        <w:gridCol w:w="1662"/>
+        <w:gridCol w:w="1662"/>
+        <w:gridCol w:w="1662"/>
+        <w:gridCol w:w="1662"/>
+        <w:gridCol w:w="1662"/>
       </w:tblGrid>
       <w:tr>
         <w:tc>
           <w:tcPr>
-            <w:tcW w:type="dxa" w:w="1440"/>
+            <w:tcW w:type="dxa" w:w="1662"/>
             <w:shd w:val="clear" w:color="auto" w:fill="1F7A4D"/>
           </w:tcPr>
           <w:p>
+            <w:pPr>
+              <w:jc w:val="center"/>
+            </w:pPr>
             <w:r/>
             <w:r>
               <w:rPr>
@@ -1348,10 +1662,13 @@
         </w:tc>
         <w:tc>
           <w:tcPr>
-            <w:tcW w:type="dxa" w:w="1440"/>
+            <w:tcW w:type="dxa" w:w="1662"/>
             <w:shd w:val="clear" w:color="auto" w:fill="1F7A4D"/>
           </w:tcPr>
           <w:p>
+            <w:pPr>
+              <w:jc w:val="center"/>
+            </w:pPr>
             <w:r/>
             <w:r>
               <w:rPr>
@@ -1366,10 +1683,13 @@
         </w:tc>
         <w:tc>
           <w:tcPr>
-            <w:tcW w:type="dxa" w:w="1440"/>
+            <w:tcW w:type="dxa" w:w="1662"/>
             <w:shd w:val="clear" w:color="auto" w:fill="1F7A4D"/>
           </w:tcPr>
           <w:p>
+            <w:pPr>
+              <w:jc w:val="center"/>
+            </w:pPr>
             <w:r/>
             <w:r>
               <w:rPr>
@@ -1384,10 +1704,13 @@
         </w:tc>
         <w:tc>
           <w:tcPr>
-            <w:tcW w:type="dxa" w:w="1440"/>
+            <w:tcW w:type="dxa" w:w="1662"/>
             <w:shd w:val="clear" w:color="auto" w:fill="1F7A4D"/>
           </w:tcPr>
           <w:p>
+            <w:pPr>
+              <w:jc w:val="center"/>
+            </w:pPr>
             <w:r/>
             <w:r>
               <w:rPr>
@@ -1402,10 +1725,13 @@
         </w:tc>
         <w:tc>
           <w:tcPr>
-            <w:tcW w:type="dxa" w:w="1440"/>
+            <w:tcW w:type="dxa" w:w="1662"/>
             <w:shd w:val="clear" w:color="auto" w:fill="1F7A4D"/>
           </w:tcPr>
           <w:p>
+            <w:pPr>
+              <w:jc w:val="center"/>
+            </w:pPr>
             <w:r/>
             <w:r>
               <w:rPr>
@@ -1420,10 +1746,13 @@
         </w:tc>
         <w:tc>
           <w:tcPr>
-            <w:tcW w:type="dxa" w:w="1440"/>
+            <w:tcW w:type="dxa" w:w="1662"/>
             <w:shd w:val="clear" w:color="auto" w:fill="1F7A4D"/>
           </w:tcPr>
           <w:p>
+            <w:pPr>
+              <w:jc w:val="center"/>
+            </w:pPr>
             <w:r/>
             <w:r>
               <w:rPr>
@@ -1440,41 +1769,48 @@
       <w:tr>
         <w:tc>
           <w:tcPr>
-            <w:tcW w:type="dxa" w:w="1440"/>
+            <w:tcW w:type="dxa" w:w="1662"/>
           </w:tcPr>
           <w:p>
+            <w:r/>
             <w:r>
+              <w:rPr>
+                <w:rFonts w:ascii="Microsoft YaHei" w:hAnsi="Microsoft YaHei" w:eastAsia="Microsoft YaHei"/>
+                <w:b w:val="0"/>
+                <w:color w:val="94A3B8"/>
+                <w:sz w:val="18"/>
+              </w:rPr>
               <w:t>{%tr for m in r.data.normal|default([]) %}</w:t>
             </w:r>
           </w:p>
         </w:tc>
         <w:tc>
           <w:tcPr>
-            <w:tcW w:type="dxa" w:w="1440"/>
+            <w:tcW w:type="dxa" w:w="1662"/>
           </w:tcPr>
           <w:p/>
         </w:tc>
         <w:tc>
           <w:tcPr>
-            <w:tcW w:type="dxa" w:w="1440"/>
+            <w:tcW w:type="dxa" w:w="1662"/>
           </w:tcPr>
           <w:p/>
         </w:tc>
         <w:tc>
           <w:tcPr>
-            <w:tcW w:type="dxa" w:w="1440"/>
+            <w:tcW w:type="dxa" w:w="1662"/>
           </w:tcPr>
           <w:p/>
         </w:tc>
         <w:tc>
           <w:tcPr>
-            <w:tcW w:type="dxa" w:w="1440"/>
+            <w:tcW w:type="dxa" w:w="1662"/>
           </w:tcPr>
           <w:p/>
         </w:tc>
         <w:tc>
           <w:tcPr>
-            <w:tcW w:type="dxa" w:w="1440"/>
+            <w:tcW w:type="dxa" w:w="1662"/>
           </w:tcPr>
           <w:p/>
         </w:tc>
@@ -1482,7 +1818,7 @@
       <w:tr>
         <w:tc>
           <w:tcPr>
-            <w:tcW w:type="dxa" w:w="1440"/>
+            <w:tcW w:type="dxa" w:w="1662"/>
           </w:tcPr>
           <w:p>
             <w:r/>
@@ -1491,7 +1827,7 @@
                 <w:rFonts w:ascii="Microsoft YaHei" w:hAnsi="Microsoft YaHei" w:eastAsia="Microsoft YaHei"/>
                 <w:b w:val="0"/>
                 <w:color w:val="1E293B"/>
-                <w:sz w:val="22"/>
+                <w:sz w:val="20"/>
               </w:rPr>
               <w:t>{{ m.object_name }}</w:t>
             </w:r>
@@ -1499,7 +1835,7 @@
         </w:tc>
         <w:tc>
           <w:tcPr>
-            <w:tcW w:type="dxa" w:w="1440"/>
+            <w:tcW w:type="dxa" w:w="1662"/>
           </w:tcPr>
           <w:p>
             <w:r/>
@@ -1508,7 +1844,7 @@
                 <w:rFonts w:ascii="Microsoft YaHei" w:hAnsi="Microsoft YaHei" w:eastAsia="Microsoft YaHei"/>
                 <w:b w:val="0"/>
                 <w:color w:val="1E293B"/>
-                <w:sz w:val="22"/>
+                <w:sz w:val="20"/>
               </w:rPr>
               <w:t>{{ m.category }}</w:t>
             </w:r>
@@ -1516,7 +1852,7 @@
         </w:tc>
         <w:tc>
           <w:tcPr>
-            <w:tcW w:type="dxa" w:w="1440"/>
+            <w:tcW w:type="dxa" w:w="1662"/>
           </w:tcPr>
           <w:p>
             <w:r/>
@@ -1525,15 +1861,15 @@
                 <w:rFonts w:ascii="Microsoft YaHei" w:hAnsi="Microsoft YaHei" w:eastAsia="Microsoft YaHei"/>
                 <w:b w:val="0"/>
                 <w:color w:val="1E293B"/>
-                <w:sz w:val="22"/>
+                <w:sz w:val="20"/>
               </w:rPr>
-              <w:t>{{ m.metric_name }}</w:t>
+              <w:t>{{ m.display_name|default(m.metric_name) }}</w:t>
             </w:r>
           </w:p>
         </w:tc>
         <w:tc>
           <w:tcPr>
-            <w:tcW w:type="dxa" w:w="1440"/>
+            <w:tcW w:type="dxa" w:w="1662"/>
           </w:tcPr>
           <w:p>
             <w:r/>
@@ -1542,7 +1878,7 @@
                 <w:rFonts w:ascii="Microsoft YaHei" w:hAnsi="Microsoft YaHei" w:eastAsia="Microsoft YaHei"/>
                 <w:b w:val="0"/>
                 <w:color w:val="1E293B"/>
-                <w:sz w:val="22"/>
+                <w:sz w:val="20"/>
               </w:rPr>
               <w:t>{{ m.value }} {{ m.unit }}</w:t>
             </w:r>
@@ -1550,7 +1886,7 @@
         </w:tc>
         <w:tc>
           <w:tcPr>
-            <w:tcW w:type="dxa" w:w="1440"/>
+            <w:tcW w:type="dxa" w:w="1662"/>
           </w:tcPr>
           <w:p>
             <w:r/>
@@ -1559,7 +1895,7 @@
                 <w:rFonts w:ascii="Microsoft YaHei" w:hAnsi="Microsoft YaHei" w:eastAsia="Microsoft YaHei"/>
                 <w:b w:val="0"/>
                 <w:color w:val="1E293B"/>
-                <w:sz w:val="22"/>
+                <w:sz w:val="20"/>
               </w:rPr>
               <w:t>告警 {{ m.warning_threshold }} / 严重 {{ m.critical_threshold }}</w:t>
             </w:r>
@@ -1567,7 +1903,7 @@
         </w:tc>
         <w:tc>
           <w:tcPr>
-            <w:tcW w:type="dxa" w:w="1440"/>
+            <w:tcW w:type="dxa" w:w="1662"/>
           </w:tcPr>
           <w:p>
             <w:r/>
@@ -1576,7 +1912,7 @@
                 <w:rFonts w:ascii="Microsoft YaHei" w:hAnsi="Microsoft YaHei" w:eastAsia="Microsoft YaHei"/>
                 <w:b w:val="0"/>
                 <w:color w:val="1E293B"/>
-                <w:sz w:val="22"/>
+                <w:sz w:val="20"/>
               </w:rPr>
               <w:t>{{ m.detail }}</w:t>
             </w:r>
@@ -1586,63 +1922,77 @@
       <w:tr>
         <w:tc>
           <w:tcPr>
-            <w:tcW w:type="dxa" w:w="1440"/>
+            <w:tcW w:type="dxa" w:w="1662"/>
           </w:tcPr>
           <w:p>
+            <w:r/>
             <w:r>
+              <w:rPr>
+                <w:rFonts w:ascii="Microsoft YaHei" w:hAnsi="Microsoft YaHei" w:eastAsia="Microsoft YaHei"/>
+                <w:b w:val="0"/>
+                <w:color w:val="94A3B8"/>
+                <w:sz w:val="18"/>
+              </w:rPr>
               <w:t>{%tr endfor %}</w:t>
             </w:r>
           </w:p>
         </w:tc>
         <w:tc>
           <w:tcPr>
-            <w:tcW w:type="dxa" w:w="1440"/>
+            <w:tcW w:type="dxa" w:w="1662"/>
           </w:tcPr>
           <w:p/>
         </w:tc>
         <w:tc>
           <w:tcPr>
-            <w:tcW w:type="dxa" w:w="1440"/>
+            <w:tcW w:type="dxa" w:w="1662"/>
           </w:tcPr>
           <w:p/>
         </w:tc>
         <w:tc>
           <w:tcPr>
-            <w:tcW w:type="dxa" w:w="1440"/>
+            <w:tcW w:type="dxa" w:w="1662"/>
           </w:tcPr>
           <w:p/>
         </w:tc>
         <w:tc>
           <w:tcPr>
-            <w:tcW w:type="dxa" w:w="1440"/>
+            <w:tcW w:type="dxa" w:w="1662"/>
           </w:tcPr>
           <w:p/>
         </w:tc>
         <w:tc>
           <w:tcPr>
-            <w:tcW w:type="dxa" w:w="1440"/>
+            <w:tcW w:type="dxa" w:w="1662"/>
           </w:tcPr>
           <w:p/>
         </w:tc>
       </w:tr>
     </w:tbl>
+    <w:p/>
     <w:p>
+      <w:pPr>
+        <w:spacing w:after="40" w:before="0"/>
+      </w:pPr>
       <w:r>
         <w:rPr>
           <w:rFonts w:ascii="Microsoft YaHei" w:hAnsi="Microsoft YaHei" w:eastAsia="Microsoft YaHei"/>
           <w:b/>
           <w:color w:val="1F4E79"/>
-          <w:sz w:val="32"/>
+          <w:sz w:val="24"/>
         </w:rPr>
         <w:t>检查明细</w:t>
       </w:r>
     </w:p>
     <w:p>
+      <w:pPr>
+        <w:spacing w:after="120" w:before="0"/>
+      </w:pPr>
       <w:r>
         <w:rPr>
           <w:rFonts w:ascii="Microsoft YaHei" w:hAnsi="Microsoft YaHei" w:eastAsia="Microsoft YaHei"/>
           <w:b w:val="0"/>
-          <w:color w:val="64748B"/>
+          <w:color w:val="334155"/>
           <w:sz w:val="22"/>
         </w:rPr>
         <w:t>按主机、操作系统、对象和指标展开全部采集结果，供核对原始数据。</w:t>
@@ -1655,22 +2005,25 @@
         <w:tblLook w:firstColumn="1" w:firstRow="1" w:lastColumn="0" w:lastRow="0" w:noHBand="0" w:noVBand="1" w:val="04A0"/>
       </w:tblPr>
       <w:tblGrid>
-        <w:gridCol w:w="1080"/>
-        <w:gridCol w:w="1080"/>
-        <w:gridCol w:w="1080"/>
-        <w:gridCol w:w="1080"/>
-        <w:gridCol w:w="1080"/>
-        <w:gridCol w:w="1080"/>
-        <w:gridCol w:w="1080"/>
-        <w:gridCol w:w="1080"/>
+        <w:gridCol w:w="1246"/>
+        <w:gridCol w:w="1246"/>
+        <w:gridCol w:w="1246"/>
+        <w:gridCol w:w="1246"/>
+        <w:gridCol w:w="1246"/>
+        <w:gridCol w:w="1246"/>
+        <w:gridCol w:w="1246"/>
+        <w:gridCol w:w="1246"/>
       </w:tblGrid>
       <w:tr>
         <w:tc>
           <w:tcPr>
-            <w:tcW w:type="dxa" w:w="1080"/>
+            <w:tcW w:type="dxa" w:w="1246"/>
             <w:shd w:val="clear" w:color="auto" w:fill="1F4E79"/>
           </w:tcPr>
           <w:p>
+            <w:pPr>
+              <w:jc w:val="center"/>
+            </w:pPr>
             <w:r/>
             <w:r>
               <w:rPr>
@@ -1685,10 +2038,13 @@
         </w:tc>
         <w:tc>
           <w:tcPr>
-            <w:tcW w:type="dxa" w:w="1080"/>
+            <w:tcW w:type="dxa" w:w="1246"/>
             <w:shd w:val="clear" w:color="auto" w:fill="1F4E79"/>
           </w:tcPr>
           <w:p>
+            <w:pPr>
+              <w:jc w:val="center"/>
+            </w:pPr>
             <w:r/>
             <w:r>
               <w:rPr>
@@ -1703,10 +2059,13 @@
         </w:tc>
         <w:tc>
           <w:tcPr>
-            <w:tcW w:type="dxa" w:w="1080"/>
+            <w:tcW w:type="dxa" w:w="1246"/>
             <w:shd w:val="clear" w:color="auto" w:fill="1F4E79"/>
           </w:tcPr>
           <w:p>
+            <w:pPr>
+              <w:jc w:val="center"/>
+            </w:pPr>
             <w:r/>
             <w:r>
               <w:rPr>
@@ -1721,10 +2080,13 @@
         </w:tc>
         <w:tc>
           <w:tcPr>
-            <w:tcW w:type="dxa" w:w="1080"/>
+            <w:tcW w:type="dxa" w:w="1246"/>
             <w:shd w:val="clear" w:color="auto" w:fill="1F4E79"/>
           </w:tcPr>
           <w:p>
+            <w:pPr>
+              <w:jc w:val="center"/>
+            </w:pPr>
             <w:r/>
             <w:r>
               <w:rPr>
@@ -1739,10 +2101,13 @@
         </w:tc>
         <w:tc>
           <w:tcPr>
-            <w:tcW w:type="dxa" w:w="1080"/>
+            <w:tcW w:type="dxa" w:w="1246"/>
             <w:shd w:val="clear" w:color="auto" w:fill="1F4E79"/>
           </w:tcPr>
           <w:p>
+            <w:pPr>
+              <w:jc w:val="center"/>
+            </w:pPr>
             <w:r/>
             <w:r>
               <w:rPr>
@@ -1757,10 +2122,13 @@
         </w:tc>
         <w:tc>
           <w:tcPr>
-            <w:tcW w:type="dxa" w:w="1080"/>
+            <w:tcW w:type="dxa" w:w="1246"/>
             <w:shd w:val="clear" w:color="auto" w:fill="1F4E79"/>
           </w:tcPr>
           <w:p>
+            <w:pPr>
+              <w:jc w:val="center"/>
+            </w:pPr>
             <w:r/>
             <w:r>
               <w:rPr>
@@ -1775,10 +2143,13 @@
         </w:tc>
         <w:tc>
           <w:tcPr>
-            <w:tcW w:type="dxa" w:w="1080"/>
+            <w:tcW w:type="dxa" w:w="1246"/>
             <w:shd w:val="clear" w:color="auto" w:fill="1F4E79"/>
           </w:tcPr>
           <w:p>
+            <w:pPr>
+              <w:jc w:val="center"/>
+            </w:pPr>
             <w:r/>
             <w:r>
               <w:rPr>
@@ -1793,10 +2164,13 @@
         </w:tc>
         <w:tc>
           <w:tcPr>
-            <w:tcW w:type="dxa" w:w="1080"/>
+            <w:tcW w:type="dxa" w:w="1246"/>
             <w:shd w:val="clear" w:color="auto" w:fill="1F4E79"/>
           </w:tcPr>
           <w:p>
+            <w:pPr>
+              <w:jc w:val="center"/>
+            </w:pPr>
             <w:r/>
             <w:r>
               <w:rPr>
@@ -1813,53 +2187,60 @@
       <w:tr>
         <w:tc>
           <w:tcPr>
-            <w:tcW w:type="dxa" w:w="1080"/>
+            <w:tcW w:type="dxa" w:w="1246"/>
           </w:tcPr>
           <w:p>
+            <w:r/>
             <w:r>
+              <w:rPr>
+                <w:rFonts w:ascii="Microsoft YaHei" w:hAnsi="Microsoft YaHei" w:eastAsia="Microsoft YaHei"/>
+                <w:b w:val="0"/>
+                <w:color w:val="94A3B8"/>
+                <w:sz w:val="18"/>
+              </w:rPr>
               <w:t>{%tr for m in r.data.metrics|default([]) %}</w:t>
             </w:r>
           </w:p>
         </w:tc>
         <w:tc>
           <w:tcPr>
-            <w:tcW w:type="dxa" w:w="1080"/>
+            <w:tcW w:type="dxa" w:w="1246"/>
           </w:tcPr>
           <w:p/>
         </w:tc>
         <w:tc>
           <w:tcPr>
-            <w:tcW w:type="dxa" w:w="1080"/>
+            <w:tcW w:type="dxa" w:w="1246"/>
           </w:tcPr>
           <w:p/>
         </w:tc>
         <w:tc>
           <w:tcPr>
-            <w:tcW w:type="dxa" w:w="1080"/>
+            <w:tcW w:type="dxa" w:w="1246"/>
           </w:tcPr>
           <w:p/>
         </w:tc>
         <w:tc>
           <w:tcPr>
-            <w:tcW w:type="dxa" w:w="1080"/>
+            <w:tcW w:type="dxa" w:w="1246"/>
           </w:tcPr>
           <w:p/>
         </w:tc>
         <w:tc>
           <w:tcPr>
-            <w:tcW w:type="dxa" w:w="1080"/>
+            <w:tcW w:type="dxa" w:w="1246"/>
           </w:tcPr>
           <w:p/>
         </w:tc>
         <w:tc>
           <w:tcPr>
-            <w:tcW w:type="dxa" w:w="1080"/>
+            <w:tcW w:type="dxa" w:w="1246"/>
           </w:tcPr>
           <w:p/>
         </w:tc>
         <w:tc>
           <w:tcPr>
-            <w:tcW w:type="dxa" w:w="1080"/>
+            <w:tcW w:type="dxa" w:w="1246"/>
           </w:tcPr>
           <w:p/>
         </w:tc>
@@ -1867,7 +2248,7 @@
       <w:tr>
         <w:tc>
           <w:tcPr>
-            <w:tcW w:type="dxa" w:w="1080"/>
+            <w:tcW w:type="dxa" w:w="1246"/>
           </w:tcPr>
           <w:p>
             <w:r/>
@@ -1876,7 +2257,7 @@
                 <w:rFonts w:ascii="Microsoft YaHei" w:hAnsi="Microsoft YaHei" w:eastAsia="Microsoft YaHei"/>
                 <w:b w:val="0"/>
                 <w:color w:val="1E293B"/>
-                <w:sz w:val="22"/>
+                <w:sz w:val="20"/>
               </w:rPr>
               <w:t>{{ r.target.name }}</w:t>
             </w:r>
@@ -1884,7 +2265,7 @@
         </w:tc>
         <w:tc>
           <w:tcPr>
-            <w:tcW w:type="dxa" w:w="1080"/>
+            <w:tcW w:type="dxa" w:w="1246"/>
           </w:tcPr>
           <w:p>
             <w:r/>
@@ -1893,7 +2274,7 @@
                 <w:rFonts w:ascii="Microsoft YaHei" w:hAnsi="Microsoft YaHei" w:eastAsia="Microsoft YaHei"/>
                 <w:b w:val="0"/>
                 <w:color w:val="1E293B"/>
-                <w:sz w:val="22"/>
+                <w:sz w:val="20"/>
               </w:rPr>
               <w:t>{{ r.target.ip }}</w:t>
             </w:r>
@@ -1901,7 +2282,7 @@
         </w:tc>
         <w:tc>
           <w:tcPr>
-            <w:tcW w:type="dxa" w:w="1080"/>
+            <w:tcW w:type="dxa" w:w="1246"/>
           </w:tcPr>
           <w:p>
             <w:r/>
@@ -1910,7 +2291,7 @@
                 <w:rFonts w:ascii="Microsoft YaHei" w:hAnsi="Microsoft YaHei" w:eastAsia="Microsoft YaHei"/>
                 <w:b w:val="0"/>
                 <w:color w:val="1E293B"/>
-                <w:sz w:val="22"/>
+                <w:sz w:val="20"/>
               </w:rPr>
               <w:t>{{ m.object_name }}</w:t>
             </w:r>
@@ -1918,7 +2299,7 @@
         </w:tc>
         <w:tc>
           <w:tcPr>
-            <w:tcW w:type="dxa" w:w="1080"/>
+            <w:tcW w:type="dxa" w:w="1246"/>
           </w:tcPr>
           <w:p>
             <w:r/>
@@ -1927,7 +2308,7 @@
                 <w:rFonts w:ascii="Microsoft YaHei" w:hAnsi="Microsoft YaHei" w:eastAsia="Microsoft YaHei"/>
                 <w:b w:val="0"/>
                 <w:color w:val="1E293B"/>
-                <w:sz w:val="22"/>
+                <w:sz w:val="20"/>
               </w:rPr>
               <w:t>{{ m.category }}</w:t>
             </w:r>
@@ -1935,7 +2316,7 @@
         </w:tc>
         <w:tc>
           <w:tcPr>
-            <w:tcW w:type="dxa" w:w="1080"/>
+            <w:tcW w:type="dxa" w:w="1246"/>
           </w:tcPr>
           <w:p>
             <w:r/>
@@ -1944,15 +2325,15 @@
                 <w:rFonts w:ascii="Microsoft YaHei" w:hAnsi="Microsoft YaHei" w:eastAsia="Microsoft YaHei"/>
                 <w:b w:val="0"/>
                 <w:color w:val="1E293B"/>
-                <w:sz w:val="22"/>
+                <w:sz w:val="20"/>
               </w:rPr>
-              <w:t>{{ m.metric_name }}</w:t>
+              <w:t>{{ m.display_name|default(m.metric_name) }}</w:t>
             </w:r>
           </w:p>
         </w:tc>
         <w:tc>
           <w:tcPr>
-            <w:tcW w:type="dxa" w:w="1080"/>
+            <w:tcW w:type="dxa" w:w="1246"/>
           </w:tcPr>
           <w:p>
             <w:r/>
@@ -1961,7 +2342,7 @@
                 <w:rFonts w:ascii="Microsoft YaHei" w:hAnsi="Microsoft YaHei" w:eastAsia="Microsoft YaHei"/>
                 <w:b w:val="0"/>
                 <w:color w:val="1E293B"/>
-                <w:sz w:val="22"/>
+                <w:sz w:val="20"/>
               </w:rPr>
               <w:t>{{ m.value }} {{ m.unit }}</w:t>
             </w:r>
@@ -1969,7 +2350,7 @@
         </w:tc>
         <w:tc>
           <w:tcPr>
-            <w:tcW w:type="dxa" w:w="1080"/>
+            <w:tcW w:type="dxa" w:w="1246"/>
           </w:tcPr>
           <w:p>
             <w:r/>
@@ -1978,7 +2359,7 @@
                 <w:rFonts w:ascii="Microsoft YaHei" w:hAnsi="Microsoft YaHei" w:eastAsia="Microsoft YaHei"/>
                 <w:b w:val="0"/>
                 <w:color w:val="1E293B"/>
-                <w:sz w:val="22"/>
+                <w:sz w:val="20"/>
               </w:rPr>
               <w:t>{{ m.health_status }}</w:t>
             </w:r>
@@ -1986,7 +2367,7 @@
         </w:tc>
         <w:tc>
           <w:tcPr>
-            <w:tcW w:type="dxa" w:w="1080"/>
+            <w:tcW w:type="dxa" w:w="1246"/>
           </w:tcPr>
           <w:p>
             <w:r/>
@@ -1995,7 +2376,7 @@
                 <w:rFonts w:ascii="Microsoft YaHei" w:hAnsi="Microsoft YaHei" w:eastAsia="Microsoft YaHei"/>
                 <w:b w:val="0"/>
                 <w:color w:val="1E293B"/>
-                <w:sz w:val="22"/>
+                <w:sz w:val="20"/>
               </w:rPr>
               <w:t>{{ m.detail }}</w:t>
             </w:r>
@@ -2005,70 +2386,84 @@
       <w:tr>
         <w:tc>
           <w:tcPr>
-            <w:tcW w:type="dxa" w:w="1080"/>
+            <w:tcW w:type="dxa" w:w="1246"/>
           </w:tcPr>
           <w:p>
+            <w:r/>
             <w:r>
+              <w:rPr>
+                <w:rFonts w:ascii="Microsoft YaHei" w:hAnsi="Microsoft YaHei" w:eastAsia="Microsoft YaHei"/>
+                <w:b w:val="0"/>
+                <w:color w:val="94A3B8"/>
+                <w:sz w:val="18"/>
+              </w:rPr>
               <w:t>{%tr endfor %}</w:t>
             </w:r>
           </w:p>
         </w:tc>
         <w:tc>
           <w:tcPr>
-            <w:tcW w:type="dxa" w:w="1080"/>
+            <w:tcW w:type="dxa" w:w="1246"/>
           </w:tcPr>
           <w:p/>
         </w:tc>
         <w:tc>
           <w:tcPr>
-            <w:tcW w:type="dxa" w:w="1080"/>
+            <w:tcW w:type="dxa" w:w="1246"/>
           </w:tcPr>
           <w:p/>
         </w:tc>
         <w:tc>
           <w:tcPr>
-            <w:tcW w:type="dxa" w:w="1080"/>
+            <w:tcW w:type="dxa" w:w="1246"/>
           </w:tcPr>
           <w:p/>
         </w:tc>
         <w:tc>
           <w:tcPr>
-            <w:tcW w:type="dxa" w:w="1080"/>
+            <w:tcW w:type="dxa" w:w="1246"/>
           </w:tcPr>
           <w:p/>
         </w:tc>
         <w:tc>
           <w:tcPr>
-            <w:tcW w:type="dxa" w:w="1080"/>
+            <w:tcW w:type="dxa" w:w="1246"/>
           </w:tcPr>
           <w:p/>
         </w:tc>
         <w:tc>
           <w:tcPr>
-            <w:tcW w:type="dxa" w:w="1080"/>
+            <w:tcW w:type="dxa" w:w="1246"/>
           </w:tcPr>
           <w:p/>
         </w:tc>
         <w:tc>
           <w:tcPr>
-            <w:tcW w:type="dxa" w:w="1080"/>
+            <w:tcW w:type="dxa" w:w="1246"/>
           </w:tcPr>
           <w:p/>
         </w:tc>
       </w:tr>
     </w:tbl>
+    <w:p/>
     <w:p>
+      <w:pPr>
+        <w:spacing w:after="120" w:before="0"/>
+      </w:pPr>
       <w:r>
         <w:rPr>
           <w:rFonts w:ascii="Microsoft YaHei" w:hAnsi="Microsoft YaHei" w:eastAsia="Microsoft YaHei"/>
           <w:b/>
           <w:color w:val="1F4E79"/>
-          <w:sz w:val="32"/>
+          <w:sz w:val="24"/>
         </w:rPr>
         <w:t>修复优先级建议</w:t>
       </w:r>
     </w:p>
     <w:p>
+      <w:pPr>
+        <w:spacing w:after="40" w:before="0"/>
+      </w:pPr>
       <w:r>
         <w:rPr>
           <w:rFonts w:ascii="Microsoft YaHei" w:hAnsi="Microsoft YaHei" w:eastAsia="Microsoft YaHei"/>
@@ -2080,17 +2475,23 @@
       </w:r>
     </w:p>
     <w:p>
+      <w:pPr>
+        <w:spacing w:after="120" w:before="0"/>
+      </w:pPr>
       <w:r>
         <w:rPr>
           <w:rFonts w:ascii="Microsoft YaHei" w:hAnsi="Microsoft YaHei" w:eastAsia="Microsoft YaHei"/>
           <w:b w:val="0"/>
-          <w:color w:val="1E293B"/>
+          <w:color w:val="334155"/>
           <w:sz w:val="22"/>
         </w:rPr>
-        <w:t>严重项 {{ r.data.critical_count }} 个。优先处理 CPU、内存、磁盘已达到严重阈值的对象。</w:t>
+        <w:t>严重项 {{ r.data.critical_count }} 个。优先处理磁盘/内存/CPU 严重阈值、根只读、临时目录不可写等问题。</w:t>
       </w:r>
     </w:p>
     <w:p>
+      <w:pPr>
+        <w:spacing w:after="40" w:before="0"/>
+      </w:pPr>
       <w:r>
         <w:rPr>
           <w:rFonts w:ascii="Microsoft YaHei" w:hAnsi="Microsoft YaHei" w:eastAsia="Microsoft YaHei"/>
@@ -2102,17 +2503,23 @@
       </w:r>
     </w:p>
     <w:p>
+      <w:pPr>
+        <w:spacing w:after="120" w:before="0"/>
+      </w:pPr>
       <w:r>
         <w:rPr>
           <w:rFonts w:ascii="Microsoft YaHei" w:hAnsi="Microsoft YaHei" w:eastAsia="Microsoft YaHei"/>
           <w:b w:val="0"/>
-          <w:color w:val="1E293B"/>
+          <w:color w:val="334155"/>
           <w:sz w:val="22"/>
         </w:rPr>
-        <w:t>告警项 {{ r.data.warning_count }} 个。建议在本周内清理磁盘或降低负载。</w:t>
+        <w:t>告警项 {{ r.data.warning_count }} 个。建议处理告警阈值、时间不同步、远程管理/防火墙未启用、补丁过旧等。</w:t>
       </w:r>
     </w:p>
     <w:p>
+      <w:pPr>
+        <w:spacing w:after="40" w:before="0"/>
+      </w:pPr>
       <w:r>
         <w:rPr>
           <w:rFonts w:ascii="Microsoft YaHei" w:hAnsi="Microsoft YaHei" w:eastAsia="Microsoft YaHei"/>
@@ -2124,18 +2531,22 @@
       </w:r>
     </w:p>
     <w:p>
+      <w:pPr>
+        <w:spacing w:after="200" w:before="0"/>
+      </w:pPr>
       <w:r>
         <w:rPr>
           <w:rFonts w:ascii="Microsoft YaHei" w:hAnsi="Microsoft YaHei" w:eastAsia="Microsoft YaHei"/>
           <w:b w:val="0"/>
-          <w:color w:val="1E293B"/>
+          <w:color w:val="334155"/>
           <w:sz w:val="22"/>
         </w:rPr>
-        <w:t>正常项 {{ r.data.normal_count }} 个。保持现有阈值，纳入下一次巡检。</w:t>
+        <w:t>正常项 {{ r.data.normal_count }} 个。保持现有阈值，关注进程热点，纳入下一次巡检。</w:t>
       </w:r>
     </w:p>
     <w:p>
       <w:pPr>
+        <w:spacing w:after="40" w:before="0"/>
         <w:jc w:val="center"/>
       </w:pPr>
       <w:r>
@@ -2143,14 +2554,28 @@
           <w:rFonts w:ascii="Microsoft YaHei" w:hAnsi="Microsoft YaHei" w:eastAsia="Microsoft YaHei"/>
           <w:b w:val="0"/>
           <w:color w:val="64748B"/>
-          <w:sz w:val="22"/>
+          <w:sz w:val="20"/>
         </w:rPr>
         <w:t>— 报告结束 —</w:t>
       </w:r>
     </w:p>
     <w:p>
       <w:pPr>
-        <w:jc w:val="center"/>
+        <w:spacing w:after="80" w:before="0"/>
+      </w:pPr>
+      <w:r>
+        <w:rPr>
+          <w:rFonts w:ascii="Microsoft YaHei" w:hAnsi="Microsoft YaHei" w:eastAsia="Microsoft YaHei"/>
+          <w:b w:val="0"/>
+          <w:color w:val="64748B"/>
+          <w:sz w:val="18"/>
+        </w:rPr>
+        <w:t>由 WeOpsX 自动生成 | {{ r.data.collected_at }}</w:t>
+      </w:r>
+    </w:p>
+    <w:p>
+      <w:pPr>
+        <w:spacing w:after="0" w:before="0"/>
       </w:pPr>
       <w:r>
         <w:rPr>
@@ -2159,17 +2584,12 @@
           <w:color w:val="94A3B8"/>
           <w:sz w:val="18"/>
         </w:rPr>
-        <w:t>由 WeOpsX 自动生成 | {{ r.data.collected_at }}</w:t>
-      </w:r>
-    </w:p>
-    <w:p>
-      <w:r>
         <w:t>{%p endfor %}</w:t>
       </w:r>
     </w:p>
     <w:sectPr>
       <w:pgSz w:w="12240" w:h="15840"/>
-      <w:pgMar w:top="1440" w:right="1800" w:bottom="1440" w:left="1800" w:header="720" w:footer="720" w:gutter="0"/>
+      <w:pgMar w:top="1020" w:right="1134" w:bottom="1020" w:left="1134" w:header="720" w:footer="720" w:gutter="0"/>
       <w:cols w:space="720"/>
       <w:docGrid w:linePitch="360"/>
     </w:sectPr>
@@ -2540,10 +2960,6 @@
     <w:name w:val="Normal"/>
     <w:qFormat/>
     <w:rsid w:val="00FC693F"/>
-    <w:rPr>
-      <w:rFonts w:ascii="Microsoft YaHei" w:hAnsi="Microsoft YaHei" w:eastAsia="Microsoft YaHei"/>
-      <w:sz w:val="22"/>
-    </w:rPr>
   </w:style>
   <w:style w:type="paragraph" w:styleId="Header">
     <w:name w:val="header"/>

</xml_diff>